<commit_message>
feat: Add development scripts and initial test cases for AGS3D project
</commit_message>
<xml_diff>
--- a/docs/AGS3D_Testing_Strategy.docx
+++ b/docs/AGS3D_Testing_Strategy.docx
@@ -208,7 +208,7 @@
           <w:sz w:val="26"/>
           <w:szCs w:val="26"/>
         </w:rPr>
-        <w:t xml:space="preserve">Two Testing Layers</w:t>
+        <w:t xml:space="preserve">Three Testing Layers</w:t>
       </w:r>
     </w:p>
     <w:p>
@@ -221,7 +221,7 @@
           <w:sz w:val="20"/>
           <w:szCs w:val="20"/>
         </w:rPr>
-        <w:t xml:space="preserve">AGS3D has two distinct layers to test, each requiring a different approach.</w:t>
+        <w:t xml:space="preserve">AGS3D has three distinct layers to test, each requiring a different approach.</w:t>
       </w:r>
     </w:p>
     <w:p>
@@ -363,7 +363,7 @@
                 <w:sz w:val="19"/>
                 <w:szCs w:val="19"/>
               </w:rPr>
-              <w:t xml:space="preserve">The AGS-spirit parser, AST, and GDScript emitter. Implemented as a Go module (tools/ag/). Tests run with go test ./... independently of Godot — no headless Godot required for M2/M3 tasks.</w:t>
+              <w:t xml:space="preserve">The AGS-spirit parser, AST, and GDScript emitter. Implemented as a Go module (tools/ag/). Tests run with .dev/test-ag.sh (go test ./...) independently of Godot — no headless Godot required for M2/M3 tasks. Test files live alongside each package (project_test.go, scanner_test.go, parser_test.go, emitter_test.go).</w:t>
             </w:r>
           </w:p>
         </w:tc>
@@ -1905,7 +1905,9 @@
           <w:sz w:val="18"/>
           <w:szCs w:val="18"/>
         </w:rPr>
-        <w:t xml:space="preserve">echo 'All tests passed.'</w:t>
+        <w:t xml:space="preserve">echo 'Running Go transpiler tests...'
+cd tools/ag &amp;&amp; go test ./... &amp;&amp; cd ../..
+echo 'All tests passed.'</w:t>
       </w:r>
     </w:p>
     <w:p>
@@ -4197,7 +4199,7 @@
                 <w:sz w:val="18"/>
                 <w:szCs w:val="18"/>
               </w:rPr>
-              <w:t xml:space="preserve">C++/GDScript</w:t>
+              <w:t xml:space="preserve">Go</w:t>
             </w:r>
           </w:p>
         </w:tc>
@@ -4344,7 +4346,7 @@
                 <w:sz w:val="18"/>
                 <w:szCs w:val="18"/>
               </w:rPr>
-              <w:t xml:space="preserve">C++/GDScript</w:t>
+              <w:t xml:space="preserve">Go</w:t>
             </w:r>
           </w:p>
         </w:tc>
@@ -4491,7 +4493,7 @@
                 <w:sz w:val="18"/>
                 <w:szCs w:val="18"/>
               </w:rPr>
-              <w:t xml:space="preserve">C++/GDScript</w:t>
+              <w:t xml:space="preserve">Go</w:t>
             </w:r>
           </w:p>
         </w:tc>
@@ -4638,7 +4640,7 @@
                 <w:sz w:val="18"/>
                 <w:szCs w:val="18"/>
               </w:rPr>
-              <w:t xml:space="preserve">C++/GDScript</w:t>
+              <w:t xml:space="preserve">Go</w:t>
             </w:r>
           </w:p>
         </w:tc>
@@ -4785,7 +4787,7 @@
                 <w:sz w:val="18"/>
                 <w:szCs w:val="18"/>
               </w:rPr>
-              <w:t xml:space="preserve">C++/GDScript</w:t>
+              <w:t xml:space="preserve">Go</w:t>
             </w:r>
           </w:p>
         </w:tc>
@@ -4932,7 +4934,7 @@
                 <w:sz w:val="18"/>
                 <w:szCs w:val="18"/>
               </w:rPr>
-              <w:t xml:space="preserve">C++/GDScript</w:t>
+              <w:t xml:space="preserve">Go</w:t>
             </w:r>
           </w:p>
         </w:tc>
@@ -5079,7 +5081,7 @@
                 <w:sz w:val="18"/>
                 <w:szCs w:val="18"/>
               </w:rPr>
-              <w:t xml:space="preserve">C++/GDScript</w:t>
+              <w:t xml:space="preserve">Go</w:t>
             </w:r>
           </w:p>
         </w:tc>
@@ -5226,7 +5228,7 @@
                 <w:sz w:val="18"/>
                 <w:szCs w:val="18"/>
               </w:rPr>
-              <w:t xml:space="preserve">C++/GDScript</w:t>
+              <w:t xml:space="preserve">Go</w:t>
             </w:r>
           </w:p>
         </w:tc>
@@ -5373,7 +5375,7 @@
                 <w:sz w:val="18"/>
                 <w:szCs w:val="18"/>
               </w:rPr>
-              <w:t xml:space="preserve">C++/GDScript</w:t>
+              <w:t xml:space="preserve">Go</w:t>
             </w:r>
           </w:p>
         </w:tc>
@@ -5520,7 +5522,7 @@
                 <w:sz w:val="18"/>
                 <w:szCs w:val="18"/>
               </w:rPr>
-              <w:t xml:space="preserve">C++/GDScript</w:t>
+              <w:t xml:space="preserve">Go</w:t>
             </w:r>
           </w:p>
         </w:tc>
@@ -5667,7 +5669,7 @@
                 <w:sz w:val="18"/>
                 <w:szCs w:val="18"/>
               </w:rPr>
-              <w:t xml:space="preserve">C++/GDScript</w:t>
+              <w:t xml:space="preserve">Go</w:t>
             </w:r>
           </w:p>
         </w:tc>
@@ -5814,7 +5816,7 @@
                 <w:sz w:val="18"/>
                 <w:szCs w:val="18"/>
               </w:rPr>
-              <w:t xml:space="preserve">C++/GDScript</w:t>
+              <w:t xml:space="preserve">Go</w:t>
             </w:r>
           </w:p>
         </w:tc>
@@ -5961,7 +5963,7 @@
                 <w:sz w:val="18"/>
                 <w:szCs w:val="18"/>
               </w:rPr>
-              <w:t xml:space="preserve">C++/GDScript</w:t>
+              <w:t xml:space="preserve">Go</w:t>
             </w:r>
           </w:p>
         </w:tc>
@@ -6108,7 +6110,7 @@
                 <w:sz w:val="18"/>
                 <w:szCs w:val="18"/>
               </w:rPr>
-              <w:t xml:space="preserve">C++/GDScript</w:t>
+              <w:t xml:space="preserve">Go</w:t>
             </w:r>
           </w:p>
         </w:tc>
@@ -6255,7 +6257,7 @@
                 <w:sz w:val="18"/>
                 <w:szCs w:val="18"/>
               </w:rPr>
-              <w:t xml:space="preserve">C++/GDScript</w:t>
+              <w:t xml:space="preserve">Go</w:t>
             </w:r>
           </w:p>
         </w:tc>
@@ -6619,7 +6621,7 @@
                 <w:sz w:val="19"/>
                 <w:szCs w:val="19"/>
               </w:rPr>
-              <w:t xml:space="preserve">Golden file comparison approach</w:t>
+              <w:t xml:space="preserve">go test + golden files (testdata/) approach</w:t>
             </w:r>
           </w:p>
         </w:tc>
@@ -6660,7 +6662,7 @@
           <w:sz w:val="20"/>
           <w:szCs w:val="20"/>
         </w:rPr>
-        <w:t xml:space="preserve">Emitter tests use golden files — for each input .agscript fixture there is a corresponding expected .gd file committed to tests/m3_emitter/fixtures/. The test parses the input, emits GDScript, and does a string comparison against the golden file. If they match, the test passes.</w:t>
+        <w:t xml:space="preserve">Emitter tests use golden files (Go testdata/ pattern) — for each input .agscript fixture there is a corresponding expected .gd file committed to tests/m3_emitter/fixtures/. The test parses the input, emits GDScript, and does a string comparison against the golden file. If they match, the test passes.</w:t>
       </w:r>
     </w:p>
     <w:p>
@@ -7010,7 +7012,7 @@
                 <w:sz w:val="18"/>
                 <w:szCs w:val="18"/>
               </w:rPr>
-              <w:t xml:space="preserve">Emitter</w:t>
+              <w:t xml:space="preserve">Go</w:t>
             </w:r>
           </w:p>
         </w:tc>
@@ -7157,7 +7159,7 @@
                 <w:sz w:val="18"/>
                 <w:szCs w:val="18"/>
               </w:rPr>
-              <w:t xml:space="preserve">Emitter</w:t>
+              <w:t xml:space="preserve">Go</w:t>
             </w:r>
           </w:p>
         </w:tc>
@@ -7304,7 +7306,7 @@
                 <w:sz w:val="18"/>
                 <w:szCs w:val="18"/>
               </w:rPr>
-              <w:t xml:space="preserve">Emitter</w:t>
+              <w:t xml:space="preserve">Go</w:t>
             </w:r>
           </w:p>
         </w:tc>
@@ -7451,7 +7453,7 @@
                 <w:sz w:val="18"/>
                 <w:szCs w:val="18"/>
               </w:rPr>
-              <w:t xml:space="preserve">Emitter</w:t>
+              <w:t xml:space="preserve">Go</w:t>
             </w:r>
           </w:p>
         </w:tc>
@@ -7598,7 +7600,7 @@
                 <w:sz w:val="18"/>
                 <w:szCs w:val="18"/>
               </w:rPr>
-              <w:t xml:space="preserve">Emitter</w:t>
+              <w:t xml:space="preserve">Go</w:t>
             </w:r>
           </w:p>
         </w:tc>
@@ -7745,7 +7747,7 @@
                 <w:sz w:val="18"/>
                 <w:szCs w:val="18"/>
               </w:rPr>
-              <w:t xml:space="preserve">Emitter</w:t>
+              <w:t xml:space="preserve">Go</w:t>
             </w:r>
           </w:p>
         </w:tc>
@@ -7892,7 +7894,7 @@
                 <w:sz w:val="18"/>
                 <w:szCs w:val="18"/>
               </w:rPr>
-              <w:t xml:space="preserve">Emitter</w:t>
+              <w:t xml:space="preserve">Go</w:t>
             </w:r>
           </w:p>
         </w:tc>
@@ -8039,7 +8041,7 @@
                 <w:sz w:val="18"/>
                 <w:szCs w:val="18"/>
               </w:rPr>
-              <w:t xml:space="preserve">Emitter</w:t>
+              <w:t xml:space="preserve">Go</w:t>
             </w:r>
           </w:p>
         </w:tc>
@@ -8186,7 +8188,7 @@
                 <w:sz w:val="18"/>
                 <w:szCs w:val="18"/>
               </w:rPr>
-              <w:t xml:space="preserve">Emitter</w:t>
+              <w:t xml:space="preserve">Go</w:t>
             </w:r>
           </w:p>
         </w:tc>
@@ -8333,7 +8335,7 @@
                 <w:sz w:val="18"/>
                 <w:szCs w:val="18"/>
               </w:rPr>
-              <w:t xml:space="preserve">Emitter</w:t>
+              <w:t xml:space="preserve">Go</w:t>
             </w:r>
           </w:p>
         </w:tc>
@@ -8480,7 +8482,7 @@
                 <w:sz w:val="18"/>
                 <w:szCs w:val="18"/>
               </w:rPr>
-              <w:t xml:space="preserve">Emitter</w:t>
+              <w:t xml:space="preserve">Go</w:t>
             </w:r>
           </w:p>
         </w:tc>
@@ -16587,7 +16589,7 @@
                 <w:sz w:val="18"/>
                 <w:szCs w:val="18"/>
               </w:rPr>
-              <w:t xml:space="preserve">Fixture files + GDScript</w:t>
+              <w:t xml:space="preserve">go test + fixture files</w:t>
             </w:r>
           </w:p>
         </w:tc>
@@ -16729,7 +16731,7 @@
                 <w:sz w:val="18"/>
                 <w:szCs w:val="18"/>
               </w:rPr>
-              <w:t xml:space="preserve">Golden file comparison</w:t>
+              <w:t xml:space="preserve">go test + golden files (testdata/)</w:t>
             </w:r>
           </w:p>
         </w:tc>

</xml_diff>